<commit_message>
docs: merge step-by-step GitHub/Netlify/domain transfer instructions into the existing Manual de Instrucoes Basicas; remove the standalone guide file that duplicated it
</commit_message>
<xml_diff>
--- a/public/templates/manual-instrucoes.docx
+++ b/public/templates/manual-instrucoes.docx
@@ -192,6 +192,142 @@
     </w:p>
     <w:p>
       <w:pPr>
+        <w:spacing w:after="130"/>
+        <w:jc w:val="both"/>
+      </w:pPr>
+      <w:r>
+        <w:rPr>
+          <w:rFonts w:ascii="Calibri" w:cs="Calibri" w:eastAsia="Calibri" w:hAnsi="Calibri"/>
+          <w:sz w:val="22"/>
+          <w:szCs w:val="22"/>
+          <w:b/>
+          <w:bCs/>
+        </w:rPr>
+        <w:t xml:space="preserve">Se você preferir transferir o repositório para a sua própria conta:</w:t>
+      </w:r>
+    </w:p>
+    <w:p>
+      <w:pPr>
+        <w:spacing w:after="130"/>
+        <w:jc w:val="both"/>
+      </w:pPr>
+      <w:r>
+        <w:rPr>
+          <w:rFonts w:ascii="Calibri" w:cs="Calibri" w:eastAsia="Calibri" w:hAnsi="Calibri"/>
+          <w:sz w:val="22"/>
+          <w:szCs w:val="22"/>
+          <w:b/>
+          <w:bCs/>
+        </w:rPr>
+        <w:t xml:space="preserve">1. </w:t>
+      </w:r>
+      <w:r>
+        <w:rPr>
+          <w:rFonts w:ascii="Calibri" w:cs="Calibri" w:eastAsia="Calibri" w:hAnsi="Calibri"/>
+          <w:sz w:val="22"/>
+          <w:szCs w:val="22"/>
+        </w:rPr>
+        <w:t xml:space="preserve">Crie uma conta gratuita em github.com, caso ainda não tenha uma.</w:t>
+      </w:r>
+    </w:p>
+    <w:p>
+      <w:pPr>
+        <w:spacing w:after="130"/>
+        <w:jc w:val="both"/>
+      </w:pPr>
+      <w:r>
+        <w:rPr>
+          <w:rFonts w:ascii="Calibri" w:cs="Calibri" w:eastAsia="Calibri" w:hAnsi="Calibri"/>
+          <w:sz w:val="22"/>
+          <w:szCs w:val="22"/>
+          <w:b/>
+          <w:bCs/>
+        </w:rPr>
+        <w:t xml:space="preserve">2. </w:t>
+      </w:r>
+      <w:r>
+        <w:rPr>
+          <w:rFonts w:ascii="Calibri" w:cs="Calibri" w:eastAsia="Calibri" w:hAnsi="Calibri"/>
+          <w:sz w:val="22"/>
+          <w:szCs w:val="22"/>
+        </w:rPr>
+        <w:t xml:space="preserve">Envie o seu nome de usuário do GitHub para a ēloSites, pelo WhatsApp ou e-mail.</w:t>
+      </w:r>
+    </w:p>
+    <w:p>
+      <w:pPr>
+        <w:spacing w:after="130"/>
+        <w:jc w:val="both"/>
+      </w:pPr>
+      <w:r>
+        <w:rPr>
+          <w:rFonts w:ascii="Calibri" w:cs="Calibri" w:eastAsia="Calibri" w:hAnsi="Calibri"/>
+          <w:sz w:val="22"/>
+          <w:szCs w:val="22"/>
+          <w:b/>
+          <w:bCs/>
+        </w:rPr>
+        <w:t xml:space="preserve">3. </w:t>
+      </w:r>
+      <w:r>
+        <w:rPr>
+          <w:rFonts w:ascii="Calibri" w:cs="Calibri" w:eastAsia="Calibri" w:hAnsi="Calibri"/>
+          <w:sz w:val="22"/>
+          <w:szCs w:val="22"/>
+        </w:rPr>
+        <w:t xml:space="preserve">A ēloSites transfere a propriedade do repositório para a sua conta, ou adiciona você como colaborador(a) com acesso total, conforme combinado no Termo de Transferência.</w:t>
+      </w:r>
+    </w:p>
+    <w:p>
+      <w:pPr>
+        <w:spacing w:after="130"/>
+        <w:jc w:val="both"/>
+      </w:pPr>
+      <w:r>
+        <w:rPr>
+          <w:rFonts w:ascii="Calibri" w:cs="Calibri" w:eastAsia="Calibri" w:hAnsi="Calibri"/>
+          <w:sz w:val="22"/>
+          <w:szCs w:val="22"/>
+          <w:b/>
+          <w:bCs/>
+        </w:rPr>
+        <w:t xml:space="preserve">4. </w:t>
+      </w:r>
+      <w:r>
+        <w:rPr>
+          <w:rFonts w:ascii="Calibri" w:cs="Calibri" w:eastAsia="Calibri" w:hAnsi="Calibri"/>
+          <w:sz w:val="22"/>
+          <w:szCs w:val="22"/>
+        </w:rPr>
+        <w:t xml:space="preserve">Você recebe um e-mail de convite do GitHub. Basta clicar em "Accept invitation" (Aceitar convite).</w:t>
+      </w:r>
+    </w:p>
+    <w:p>
+      <w:pPr>
+        <w:spacing w:after="130"/>
+        <w:jc w:val="both"/>
+      </w:pPr>
+      <w:r>
+        <w:rPr>
+          <w:rFonts w:ascii="Calibri" w:cs="Calibri" w:eastAsia="Calibri" w:hAnsi="Calibri"/>
+          <w:sz w:val="22"/>
+          <w:szCs w:val="22"/>
+          <w:b/>
+          <w:bCs/>
+        </w:rPr>
+        <w:t xml:space="preserve">5. </w:t>
+      </w:r>
+      <w:r>
+        <w:rPr>
+          <w:rFonts w:ascii="Calibri" w:cs="Calibri" w:eastAsia="Calibri" w:hAnsi="Calibri"/>
+          <w:sz w:val="22"/>
+          <w:szCs w:val="22"/>
+        </w:rPr>
+        <w:t xml:space="preserve">Pronto: o repositório passa a estar acessível pela sua própria conta.</w:t>
+      </w:r>
+    </w:p>
+    <w:p>
+      <w:pPr>
         <w:pStyle w:val="Heading1"/>
         <w:spacing w:after="110" w:before="240"/>
       </w:pPr>
@@ -281,6 +417,142 @@
     </w:p>
     <w:p>
       <w:pPr>
+        <w:spacing w:after="130"/>
+        <w:jc w:val="both"/>
+      </w:pPr>
+      <w:r>
+        <w:rPr>
+          <w:rFonts w:ascii="Calibri" w:cs="Calibri" w:eastAsia="Calibri" w:hAnsi="Calibri"/>
+          <w:sz w:val="22"/>
+          <w:szCs w:val="22"/>
+          <w:b/>
+          <w:bCs/>
+        </w:rPr>
+        <w:t xml:space="preserve">Se você preferir transferir a hospedagem para a sua própria conta:</w:t>
+      </w:r>
+    </w:p>
+    <w:p>
+      <w:pPr>
+        <w:spacing w:after="130"/>
+        <w:jc w:val="both"/>
+      </w:pPr>
+      <w:r>
+        <w:rPr>
+          <w:rFonts w:ascii="Calibri" w:cs="Calibri" w:eastAsia="Calibri" w:hAnsi="Calibri"/>
+          <w:sz w:val="22"/>
+          <w:szCs w:val="22"/>
+          <w:b/>
+          <w:bCs/>
+        </w:rPr>
+        <w:t xml:space="preserve">1. </w:t>
+      </w:r>
+      <w:r>
+        <w:rPr>
+          <w:rFonts w:ascii="Calibri" w:cs="Calibri" w:eastAsia="Calibri" w:hAnsi="Calibri"/>
+          <w:sz w:val="22"/>
+          <w:szCs w:val="22"/>
+        </w:rPr>
+        <w:t xml:space="preserve">Crie uma conta gratuita em netlify.com, caso ainda não tenha uma (pode ser com e-mail próprio ou com login do GitHub).</w:t>
+      </w:r>
+    </w:p>
+    <w:p>
+      <w:pPr>
+        <w:spacing w:after="130"/>
+        <w:jc w:val="both"/>
+      </w:pPr>
+      <w:r>
+        <w:rPr>
+          <w:rFonts w:ascii="Calibri" w:cs="Calibri" w:eastAsia="Calibri" w:hAnsi="Calibri"/>
+          <w:sz w:val="22"/>
+          <w:szCs w:val="22"/>
+          <w:b/>
+          <w:bCs/>
+        </w:rPr>
+        <w:t xml:space="preserve">2. </w:t>
+      </w:r>
+      <w:r>
+        <w:rPr>
+          <w:rFonts w:ascii="Calibri" w:cs="Calibri" w:eastAsia="Calibri" w:hAnsi="Calibri"/>
+          <w:sz w:val="22"/>
+          <w:szCs w:val="22"/>
+        </w:rPr>
+        <w:t xml:space="preserve">Envie o e-mail cadastrado no Netlify para a ēloSites.</w:t>
+      </w:r>
+    </w:p>
+    <w:p>
+      <w:pPr>
+        <w:spacing w:after="130"/>
+        <w:jc w:val="both"/>
+      </w:pPr>
+      <w:r>
+        <w:rPr>
+          <w:rFonts w:ascii="Calibri" w:cs="Calibri" w:eastAsia="Calibri" w:hAnsi="Calibri"/>
+          <w:sz w:val="22"/>
+          <w:szCs w:val="22"/>
+          <w:b/>
+          <w:bCs/>
+        </w:rPr>
+        <w:t xml:space="preserve">3. </w:t>
+      </w:r>
+      <w:r>
+        <w:rPr>
+          <w:rFonts w:ascii="Calibri" w:cs="Calibri" w:eastAsia="Calibri" w:hAnsi="Calibri"/>
+          <w:sz w:val="22"/>
+          <w:szCs w:val="22"/>
+        </w:rPr>
+        <w:t xml:space="preserve">A ēloSites adiciona você como membro do time responsável pelo site, ou transfere o site inteiro para a sua conta, conforme combinado.</w:t>
+      </w:r>
+    </w:p>
+    <w:p>
+      <w:pPr>
+        <w:spacing w:after="130"/>
+        <w:jc w:val="both"/>
+      </w:pPr>
+      <w:r>
+        <w:rPr>
+          <w:rFonts w:ascii="Calibri" w:cs="Calibri" w:eastAsia="Calibri" w:hAnsi="Calibri"/>
+          <w:sz w:val="22"/>
+          <w:szCs w:val="22"/>
+          <w:b/>
+          <w:bCs/>
+        </w:rPr>
+        <w:t xml:space="preserve">4. </w:t>
+      </w:r>
+      <w:r>
+        <w:rPr>
+          <w:rFonts w:ascii="Calibri" w:cs="Calibri" w:eastAsia="Calibri" w:hAnsi="Calibri"/>
+          <w:sz w:val="22"/>
+          <w:szCs w:val="22"/>
+        </w:rPr>
+        <w:t xml:space="preserve">Você recebe um convite por e-mail do Netlify. Aceite o convite para ter acesso ao painel do site.</w:t>
+      </w:r>
+    </w:p>
+    <w:p>
+      <w:pPr>
+        <w:spacing w:after="130"/>
+        <w:jc w:val="both"/>
+      </w:pPr>
+      <w:r>
+        <w:rPr>
+          <w:rFonts w:ascii="Calibri" w:cs="Calibri" w:eastAsia="Calibri" w:hAnsi="Calibri"/>
+          <w:sz w:val="22"/>
+          <w:szCs w:val="22"/>
+          <w:b/>
+          <w:bCs/>
+        </w:rPr>
+        <w:t xml:space="preserve">5. </w:t>
+      </w:r>
+      <w:r>
+        <w:rPr>
+          <w:rFonts w:ascii="Calibri" w:cs="Calibri" w:eastAsia="Calibri" w:hAnsi="Calibri"/>
+          <w:sz w:val="22"/>
+          <w:szCs w:val="22"/>
+        </w:rPr>
+        <w:t xml:space="preserve">A partir daí, você acompanha publicações, configurações e o domínio diretamente pelo seu painel, em "Site settings".</w:t>
+      </w:r>
+    </w:p>
+    <w:p>
+      <w:pPr>
         <w:pStyle w:val="Heading1"/>
         <w:spacing w:after="110" w:before="240"/>
       </w:pPr>
@@ -378,6 +650,34 @@
           <w:szCs w:val="22"/>
         </w:rPr>
         <w:t xml:space="preserve">Se você tem um domínio próprio, ele precisa ser renovado todo ano no site onde foi registrado (ex.: Registro.br), ou o site para de funcionar nesse endereço quando vencer. Domínio e hospedagem são serviços de terceiros, contratados e pagos diretamente por você, e são independentes entre si.</w:t>
+      </w:r>
+    </w:p>
+    <w:p>
+      <w:pPr>
+        <w:spacing w:after="130"/>
+        <w:jc w:val="both"/>
+      </w:pPr>
+      <w:r>
+        <w:rPr>
+          <w:rFonts w:ascii="Calibri" w:cs="Calibri" w:eastAsia="Calibri" w:hAnsi="Calibri"/>
+          <w:sz w:val="22"/>
+          <w:szCs w:val="22"/>
+        </w:rPr>
+        <w:t xml:space="preserve">Se você preferir configurar o domínio sozinho(a): depois de comprá-lo, basta adicioná-lo no painel do Netlify em "Domain settings" &gt; "Add a domain", e apontar os servidores DNS (nameservers) ou os registros indicados pelo próprio Netlify, no provedor onde o domínio foi comprado.</w:t>
+      </w:r>
+    </w:p>
+    <w:p>
+      <w:pPr>
+        <w:spacing w:after="130"/>
+        <w:jc w:val="both"/>
+      </w:pPr>
+      <w:r>
+        <w:rPr>
+          <w:rFonts w:ascii="Calibri" w:cs="Calibri" w:eastAsia="Calibri" w:hAnsi="Calibri"/>
+          <w:sz w:val="22"/>
+          <w:szCs w:val="22"/>
+        </w:rPr>
+        <w:t xml:space="preserve">Se preferir que a ēloSites faça essa conexão por você: é só avisar quando comprar o domínio (nome do provedor utilizado e, se necessário, um acesso temporário) que a configuração de DNS e do certificado de segurança (HTTPS) é feita certinha. O valor dessa configuração, se houver, é combinado conforme o caso — podendo ser sem custo adicional, a critério da ēloSites.</w:t>
       </w:r>
     </w:p>
     <w:p>

</xml_diff>